<commit_message>
Zaehlfehler im Diagrammabschnitt berichtigt
Da stand fuenf und darunter standen sechs. In einem Dokument, das
Genauigkeit predigt, ist das die falsche Stelle zum Schlampen.

Co-Authored-By: Claude Opus 5 <noreply@anthropic.com>
</commit_message>
<xml_diff>
--- a/GKVTransmitter/Information/Schulprojekt.docx
+++ b/GKVTransmitter/Information/Schulprojekt.docx
@@ -3410,19 +3410,31 @@
           <w:bCs/>
           <w:lang w:val="de"/>
         </w:rPr>
-        <w:t xml:space="preserve">Fünf davon liegen bereits vor</w:t>
-      </w:r>
-      <w:r>
-        <w:rPr>
-          <w:lang w:val="de"/>
-        </w:rPr>
-        <w:t xml:space="preserve"> </w:t>
-      </w:r>
-      <w:r>
-        <w:rPr>
-          <w:lang w:val="de"/>
-        </w:rPr>
-        <w:t xml:space="preserve">und sind in die Gesamtdokumentation eingebettet:</w:t>
+        <w:t xml:space="preserve">Sechs Bilder liegen bereits vor</w:t>
+      </w:r>
+      <w:r>
+        <w:rPr>
+          <w:lang w:val="de"/>
+        </w:rPr>
+        <w:t xml:space="preserve"> </w:t>
+      </w:r>
+      <w:r>
+        <w:rPr>
+          <w:lang w:val="de"/>
+        </w:rPr>
+        <w:t xml:space="preserve">und sind in die Gesamtdokumentation</w:t>
+      </w:r>
+      <w:r>
+        <w:rPr>
+          <w:lang w:val="de"/>
+        </w:rPr>
+        <w:t xml:space="preserve"> </w:t>
+      </w:r>
+      <w:r>
+        <w:rPr>
+          <w:lang w:val="de"/>
+        </w:rPr>
+        <w:t xml:space="preserve">eingebettet:</w:t>
       </w:r>
       <w:r>
         <w:rPr>
@@ -3543,6 +3555,55 @@
           <w:lang w:val="de"/>
         </w:rPr>
         <w:t xml:space="preserve">.</w:t>
+      </w:r>
+    </w:p>
+    <w:p>
+      <w:pPr>
+        <w:pStyle w:val="BodyText"/>
+      </w:pPr>
+      <w:r>
+        <w:rPr>
+          <w:lang w:val="de"/>
+        </w:rPr>
+        <w:t xml:space="preserve">Von den neun oben geforderten sind damit</w:t>
+      </w:r>
+      <w:r>
+        <w:rPr>
+          <w:lang w:val="de"/>
+        </w:rPr>
+        <w:t xml:space="preserve"> </w:t>
+      </w:r>
+      <w:r>
+        <w:rPr>
+          <w:b/>
+          <w:bCs/>
+          <w:lang w:val="de"/>
+        </w:rPr>
+        <w:t xml:space="preserve">drei erledigt</w:t>
+      </w:r>
+      <w:r>
+        <w:rPr>
+          <w:lang w:val="de"/>
+        </w:rPr>
+        <w:t xml:space="preserve"> </w:t>
+      </w:r>
+      <w:r>
+        <w:rPr>
+          <w:lang w:val="de"/>
+        </w:rPr>
+        <w:t xml:space="preserve">— die Teile 05, 06</w:t>
+      </w:r>
+      <w:r>
+        <w:rPr>
+          <w:lang w:val="de"/>
+        </w:rPr>
+        <w:t xml:space="preserve"> </w:t>
+      </w:r>
+      <w:r>
+        <w:rPr>
+          <w:lang w:val="de"/>
+        </w:rPr>
+        <w:t xml:space="preserve">und 07. Die übrigen sechs entstehen dort, wo sie gebraucht werden.</w:t>
       </w:r>
     </w:p>
     <w:p>

</xml_diff>

<commit_message>
Teil 01: ein erstes Fachmodell und ein erstes Datenmodell
Zur Vision gehoert ein Bild davon, wovon ueberhaupt die Rede ist. Zwei
Diagramme auf Visionsebene, bewusst noch fachlich und nicht als Umsetzung:

- das Uebersichtsmodell der Begriffe und ihrer Beziehungen
- ein erster Entwurf dessen, was dauerhaft festgehalten werden muss

Beide sind Entwuerfe. Ihre Gegenstuecke in den Teilen 06 und 07 werden davon
abweichen, und die Abweichung ist selbst dokumentierbar - sie zeigt, was sich
beim Bauen als anders herausgestellt hat.

Zwei Stellen im ersten Rendern korrigiert: Angaben mit Klammern landeten in
der Methodenabteilung statt bei den Feldern, und zwei Klassen standen mit ue
statt Umlaut da.

Co-Authored-By: Claude Opus 5 <noreply@anthropic.com>
</commit_message>
<xml_diff>
--- a/GKVTransmitter/Information/Schulprojekt.docx
+++ b/GKVTransmitter/Information/Schulprojekt.docx
@@ -3083,7 +3083,7 @@
         <w:rPr>
           <w:lang w:val="de"/>
         </w:rPr>
-        <w:t xml:space="preserve">Neun Stück, verteilt über die Reihe — nicht am Ende in einem Schwung.</w:t>
+        <w:t xml:space="preserve">Elf Stück, verteilt über die Reihe — nicht am Ende in einem Schwung.</w:t>
       </w:r>
     </w:p>
     <w:tbl>
@@ -3140,6 +3140,66 @@
               <w:rPr>
                 <w:lang w:val="de"/>
               </w:rPr>
+              <w:t xml:space="preserve">Fachliches Übersichtsmodell (Entwurf)</w:t>
+            </w:r>
+          </w:p>
+        </w:tc>
+        <w:tc>
+          <w:tcPr/>
+          <w:p>
+            <w:pPr>
+              <w:pStyle w:val="Compact"/>
+            </w:pPr>
+            <w:r>
+              <w:rPr>
+                <w:lang w:val="de"/>
+              </w:rPr>
+              <w:t xml:space="preserve">01</w:t>
+            </w:r>
+          </w:p>
+        </w:tc>
+      </w:tr>
+      <w:tr>
+        <w:tc>
+          <w:tcPr/>
+          <w:p>
+            <w:pPr>
+              <w:pStyle w:val="Compact"/>
+            </w:pPr>
+            <w:r>
+              <w:rPr>
+                <w:lang w:val="de"/>
+              </w:rPr>
+              <w:t xml:space="preserve">Erstes Datenmodell (Entwurf)</w:t>
+            </w:r>
+          </w:p>
+        </w:tc>
+        <w:tc>
+          <w:tcPr/>
+          <w:p>
+            <w:pPr>
+              <w:pStyle w:val="Compact"/>
+            </w:pPr>
+            <w:r>
+              <w:rPr>
+                <w:lang w:val="de"/>
+              </w:rPr>
+              <w:t xml:space="preserve">01</w:t>
+            </w:r>
+          </w:p>
+        </w:tc>
+      </w:tr>
+      <w:tr>
+        <w:tc>
+          <w:tcPr/>
+          <w:p>
+            <w:pPr>
+              <w:pStyle w:val="Compact"/>
+            </w:pPr>
+            <w:r>
+              <w:rPr>
+                <w:lang w:val="de"/>
+              </w:rPr>
               <w:t xml:space="preserve">Komponenten- und Abhängigkeitsdiagramm</w:t>
             </w:r>
           </w:p>
@@ -3410,31 +3470,13 @@
           <w:bCs/>
           <w:lang w:val="de"/>
         </w:rPr>
-        <w:t xml:space="preserve">Sechs Bilder liegen bereits vor</w:t>
-      </w:r>
-      <w:r>
-        <w:rPr>
-          <w:lang w:val="de"/>
-        </w:rPr>
-        <w:t xml:space="preserve"> </w:t>
-      </w:r>
-      <w:r>
-        <w:rPr>
-          <w:lang w:val="de"/>
-        </w:rPr>
-        <w:t xml:space="preserve">und sind in die Gesamtdokumentation</w:t>
-      </w:r>
-      <w:r>
-        <w:rPr>
-          <w:lang w:val="de"/>
-        </w:rPr>
-        <w:t xml:space="preserve"> </w:t>
-      </w:r>
-      <w:r>
-        <w:rPr>
-          <w:lang w:val="de"/>
-        </w:rPr>
-        <w:t xml:space="preserve">eingebettet:</w:t>
+        <w:t xml:space="preserve">Acht Bilder liegen bereits vor</w:t>
+      </w:r>
+      <w:r>
+        <w:rPr>
+          <w:lang w:val="de"/>
+        </w:rPr>
+        <w:t xml:space="preserve">:</w:t>
       </w:r>
       <w:r>
         <w:rPr>
@@ -3447,7 +3489,57 @@
           <w:rStyle w:val="VerbatimChar"/>
           <w:lang w:val="de"/>
         </w:rPr>
-        <w:t xml:space="preserve">GKVTransmitter_Uebersicht</w:t>
+        <w:t xml:space="preserve">GKVTransmitter_Vision_Fachmodell</w:t>
+      </w:r>
+      <w:r>
+        <w:rPr>
+          <w:lang w:val="de"/>
+        </w:rPr>
+        <w:t xml:space="preserve"> </w:t>
+      </w:r>
+      <w:r>
+        <w:rPr>
+          <w:lang w:val="de"/>
+        </w:rPr>
+        <w:t xml:space="preserve">und</w:t>
+      </w:r>
+      <w:r>
+        <w:rPr>
+          <w:lang w:val="de"/>
+        </w:rPr>
+        <w:t xml:space="preserve"> </w:t>
+      </w:r>
+      <w:r>
+        <w:rPr>
+          <w:rStyle w:val="VerbatimChar"/>
+          <w:lang w:val="de"/>
+        </w:rPr>
+        <w:t xml:space="preserve">_Vision_ER</w:t>
+      </w:r>
+      <w:r>
+        <w:rPr>
+          <w:lang w:val="de"/>
+        </w:rPr>
+        <w:t xml:space="preserve"> </w:t>
+      </w:r>
+      <w:r>
+        <w:rPr>
+          <w:lang w:val="de"/>
+        </w:rPr>
+        <w:t xml:space="preserve">in Teil 01, dazu</w:t>
+      </w:r>
+      <w:r>
+        <w:rPr>
+          <w:lang w:val="de"/>
+        </w:rPr>
+        <w:t xml:space="preserve"> </w:t>
+      </w:r>
+      <w:r>
+        <w:rPr>
+          <w:rStyle w:val="VerbatimChar"/>
+          <w:lang w:val="de"/>
+        </w:rPr>
+        <w:t xml:space="preserve">_Uebersicht</w:t>
       </w:r>
       <w:r>
         <w:rPr>
@@ -3554,7 +3646,25 @@
         <w:rPr>
           <w:lang w:val="de"/>
         </w:rPr>
-        <w:t xml:space="preserve">.</w:t>
+        <w:t xml:space="preserve"> </w:t>
+      </w:r>
+      <w:r>
+        <w:rPr>
+          <w:lang w:val="de"/>
+        </w:rPr>
+        <w:t xml:space="preserve">in der</w:t>
+      </w:r>
+      <w:r>
+        <w:rPr>
+          <w:lang w:val="de"/>
+        </w:rPr>
+        <w:t xml:space="preserve"> </w:t>
+      </w:r>
+      <w:r>
+        <w:rPr>
+          <w:lang w:val="de"/>
+        </w:rPr>
+        <w:t xml:space="preserve">Gesamtdokumentation.</w:t>
       </w:r>
     </w:p>
     <w:p>
@@ -3565,7 +3675,7 @@
         <w:rPr>
           <w:lang w:val="de"/>
         </w:rPr>
-        <w:t xml:space="preserve">Von den neun oben geforderten sind damit</w:t>
+        <w:t xml:space="preserve">Von den elf Zeilen oben sind damit</w:t>
       </w:r>
       <w:r>
         <w:rPr>
@@ -3579,31 +3689,110 @@
           <w:bCs/>
           <w:lang w:val="de"/>
         </w:rPr>
-        <w:t xml:space="preserve">drei erledigt</w:t>
-      </w:r>
-      <w:r>
-        <w:rPr>
-          <w:lang w:val="de"/>
-        </w:rPr>
-        <w:t xml:space="preserve"> </w:t>
-      </w:r>
-      <w:r>
-        <w:rPr>
-          <w:lang w:val="de"/>
-        </w:rPr>
-        <w:t xml:space="preserve">— die Teile 05, 06</w:t>
-      </w:r>
-      <w:r>
-        <w:rPr>
-          <w:lang w:val="de"/>
-        </w:rPr>
-        <w:t xml:space="preserve"> </w:t>
-      </w:r>
-      <w:r>
-        <w:rPr>
-          <w:lang w:val="de"/>
-        </w:rPr>
-        <w:t xml:space="preserve">und 07. Die übrigen sechs entstehen dort, wo sie gebraucht werden.</w:t>
+        <w:t xml:space="preserve">fünf abgedeckt</w:t>
+      </w:r>
+      <w:r>
+        <w:rPr>
+          <w:lang w:val="de"/>
+        </w:rPr>
+        <w:t xml:space="preserve"> </w:t>
+      </w:r>
+      <w:r>
+        <w:rPr>
+          <w:lang w:val="de"/>
+        </w:rPr>
+        <w:t xml:space="preserve">— die Teile 01, 05, 06 und</w:t>
+      </w:r>
+      <w:r>
+        <w:rPr>
+          <w:lang w:val="de"/>
+        </w:rPr>
+        <w:t xml:space="preserve"> </w:t>
+      </w:r>
+      <w:r>
+        <w:rPr>
+          <w:lang w:val="de"/>
+        </w:rPr>
+        <w:t xml:space="preserve">07. Die übrigen sechs entstehen dort, wo sie gebraucht werden.</w:t>
+      </w:r>
+    </w:p>
+    <w:p>
+      <w:pPr>
+        <w:pStyle w:val="BodyText"/>
+      </w:pPr>
+      <w:r>
+        <w:rPr>
+          <w:lang w:val="de"/>
+        </w:rPr>
+        <w:t xml:space="preserve">Die beiden Bilder aus Teil 01 sind</w:t>
+      </w:r>
+      <w:r>
+        <w:rPr>
+          <w:lang w:val="de"/>
+        </w:rPr>
+        <w:t xml:space="preserve"> </w:t>
+      </w:r>
+      <w:r>
+        <w:rPr>
+          <w:b/>
+          <w:bCs/>
+          <w:lang w:val="de"/>
+        </w:rPr>
+        <w:t xml:space="preserve">absichtlich Entwürfe</w:t>
+      </w:r>
+      <w:r>
+        <w:rPr>
+          <w:lang w:val="de"/>
+        </w:rPr>
+        <w:t xml:space="preserve">. Sie zeigen die</w:t>
+      </w:r>
+      <w:r>
+        <w:rPr>
+          <w:lang w:val="de"/>
+        </w:rPr>
+        <w:t xml:space="preserve"> </w:t>
+      </w:r>
+      <w:r>
+        <w:rPr>
+          <w:lang w:val="de"/>
+        </w:rPr>
+        <w:t xml:space="preserve">Begriffe, bevor entschieden war, wie sie umgesetzt werden. Ihre späteren</w:t>
+      </w:r>
+      <w:r>
+        <w:rPr>
+          <w:lang w:val="de"/>
+        </w:rPr>
+        <w:t xml:space="preserve"> </w:t>
+      </w:r>
+      <w:r>
+        <w:rPr>
+          <w:lang w:val="de"/>
+        </w:rPr>
+        <w:t xml:space="preserve">Gegenstücke in den Teilen 06 und 07 weichen davon ab — und genau diese</w:t>
+      </w:r>
+      <w:r>
+        <w:rPr>
+          <w:lang w:val="de"/>
+        </w:rPr>
+        <w:t xml:space="preserve"> </w:t>
+      </w:r>
+      <w:r>
+        <w:rPr>
+          <w:lang w:val="de"/>
+        </w:rPr>
+        <w:t xml:space="preserve">Abweichung ist ein eigener Gegenstand der Dokumentation: sie zeigt, was sich</w:t>
+      </w:r>
+      <w:r>
+        <w:rPr>
+          <w:lang w:val="de"/>
+        </w:rPr>
+        <w:t xml:space="preserve"> </w:t>
+      </w:r>
+      <w:r>
+        <w:rPr>
+          <w:lang w:val="de"/>
+        </w:rPr>
+        <w:t xml:space="preserve">beim Bauen als anders herausgestellt hat.</w:t>
       </w:r>
     </w:p>
     <w:p>

</xml_diff>